<commit_message>
docs: takvim görünümü ve planned_workouts tablosunu dokümante et
</commit_message>
<xml_diff>
--- a/docs/Surec_ve_Mimari_Dokumani.docx
+++ b/docs/Surec_ve_Mimari_Dokumani.docx
@@ -1469,7 +1469,7 @@
                 <w:sz w:val="20"/>
                 <w:szCs w:val="20"/>
               </w:rPr>
-              <w:t xml:space="preserve">id, user_id, strava_activity_id, tarih, mesafe, sure, nabiz</w:t>
+              <w:t xml:space="preserve">id, user_id, strava_activity_id, tarih, mesafe, sure, nabiz, matched_planned_workout_id</w:t>
             </w:r>
           </w:p>
         </w:tc>
@@ -1492,7 +1492,7 @@
                 <w:sz w:val="20"/>
                 <w:szCs w:val="20"/>
               </w:rPr>
-              <w:t xml:space="preserve">Strava'dan senkronize edilen aktiviteler</w:t>
+              <w:t xml:space="preserve">Strava'dan senkronize edilen aktiviteler; planlanan antrenmanla eşleşme referansı içerir</w:t>
             </w:r>
           </w:p>
         </w:tc>
@@ -1568,7 +1568,107 @@
           </w:p>
         </w:tc>
       </w:tr>
+      <w:tr>
+        <w:tc>
+          <w:tcPr>
+            <w:tcW w:type="dxa" w:w="2200"/>
+            <w:tcMar>
+              <w:top w:type="dxa" w:w="100"/>
+              <w:left w:type="dxa" w:w="120"/>
+              <w:bottom w:type="dxa" w:w="100"/>
+              <w:right w:type="dxa" w:w="120"/>
+            </w:tcMar>
+          </w:tcPr>
+          <w:p>
+            <w:r>
+              <w:rPr>
+                <w:b w:val="false"/>
+                <w:bCs w:val="false"/>
+                <w:color w:val="1A1A1A"/>
+                <w:sz w:val="20"/>
+                <w:szCs w:val="20"/>
+              </w:rPr>
+              <w:t xml:space="preserve">planned_workouts</w:t>
+            </w:r>
+          </w:p>
+        </w:tc>
+        <w:tc>
+          <w:tcPr>
+            <w:tcW w:type="dxa" w:w="3900"/>
+            <w:tcMar>
+              <w:top w:type="dxa" w:w="100"/>
+              <w:left w:type="dxa" w:w="120"/>
+              <w:bottom w:type="dxa" w:w="100"/>
+              <w:right w:type="dxa" w:w="120"/>
+            </w:tcMar>
+          </w:tcPr>
+          <w:p>
+            <w:r>
+              <w:rPr>
+                <w:b w:val="false"/>
+                <w:bCs w:val="false"/>
+                <w:color w:val="1A1A1A"/>
+                <w:sz w:val="20"/>
+                <w:szCs w:val="20"/>
+              </w:rPr>
+              <w:t xml:space="preserve">id, user_id, plan_id, tarih, tur, hedef_mesafe, hedef_sure, hedef_nabiz_min, hedef_nabiz_max</w:t>
+            </w:r>
+          </w:p>
+        </w:tc>
+        <w:tc>
+          <w:tcPr>
+            <w:tcW w:type="dxa" w:w="3250"/>
+            <w:tcMar>
+              <w:top w:type="dxa" w:w="100"/>
+              <w:left w:type="dxa" w:w="120"/>
+              <w:bottom w:type="dxa" w:w="100"/>
+              <w:right w:type="dxa" w:w="120"/>
+            </w:tcMar>
+          </w:tcPr>
+          <w:p>
+            <w:r>
+              <w:rPr>
+                <w:b w:val="false"/>
+                <w:bCs w:val="false"/>
+                <w:color w:val="1A1A1A"/>
+                <w:sz w:val="20"/>
+                <w:szCs w:val="20"/>
+              </w:rPr>
+              <w:t xml:space="preserve">Günlük planlanan antrenman (takvim görünümü ve planlanan/gerçekleşen karşılaştırması için)</w:t>
+            </w:r>
+          </w:p>
+        </w:tc>
+      </w:tr>
     </w:tbl>
+    <w:p>
+      <w:pPr>
+        <w:pStyle w:val="Heading2"/>
+        <w:spacing w:after="150" w:before="300"/>
+      </w:pPr>
+      <w:r>
+        <w:rPr>
+          <w:b/>
+          <w:bCs/>
+          <w:color w:val="C0392B"/>
+          <w:sz w:val="24"/>
+          <w:szCs w:val="24"/>
+        </w:rPr>
+        <w:t xml:space="preserve">3.4 Takvim Görünümü (Planlanan / Gerçekleşen)</w:t>
+      </w:r>
+    </w:p>
+    <w:p>
+      <w:pPr>
+        <w:spacing w:after="160" w:line="300"/>
+      </w:pPr>
+      <w:r>
+        <w:rPr>
+          <w:color w:val="1A1A1A"/>
+          <w:sz w:val="22"/>
+          <w:szCs w:val="22"/>
+        </w:rPr>
+        <w:t xml:space="preserve">Kullanıcı arayüzünde bir takvim görünümü bulunur. Her gün, o güne ait planlanan antrenmanı (planned_workouts) ve varsa gerçekleşen aktiviteyi (activities_cache, matched_planned_workout_id ile eşleştirilmiş) yan yana gösterir. Bir güne tıklandığında planlanan hedef (mesafe, süre, nabız aralığı) ile gerçekleşen değerler karşılaştırmalı olarak sunulur; haftalık/aylık özet görünümünde bu ikisi çizgi grafikte iki ayrı renkle (planlanan kesikli, gerçekleşen dolu çizgi) gösterilir.</w:t>
+      </w:r>
+    </w:p>
     <w:p>
       <w:pPr>
         <w:pBdr>
@@ -2080,6 +2180,54 @@
                 <w:szCs w:val="20"/>
               </w:rPr>
               <w:t xml:space="preserve">Bildirimler, çoklu spor desteği, PT geri bildirim döngüsü</w:t>
+            </w:r>
+          </w:p>
+        </w:tc>
+      </w:tr>
+      <w:tr>
+        <w:tc>
+          <w:tcPr>
+            <w:tcW w:type="dxa" w:w="2600"/>
+            <w:tcMar>
+              <w:top w:type="dxa" w:w="100"/>
+              <w:left w:type="dxa" w:w="120"/>
+              <w:bottom w:type="dxa" w:w="100"/>
+              <w:right w:type="dxa" w:w="120"/>
+            </w:tcMar>
+          </w:tcPr>
+          <w:p>
+            <w:r>
+              <w:rPr>
+                <w:b w:val="false"/>
+                <w:bCs w:val="false"/>
+                <w:color w:val="1A1A1A"/>
+                <w:sz w:val="20"/>
+                <w:szCs w:val="20"/>
+              </w:rPr>
+              <w:t xml:space="preserve">Faz 6 — Takvim Görünümü</w:t>
+            </w:r>
+          </w:p>
+        </w:tc>
+        <w:tc>
+          <w:tcPr>
+            <w:tcW w:type="dxa" w:w="6750"/>
+            <w:tcMar>
+              <w:top w:type="dxa" w:w="100"/>
+              <w:left w:type="dxa" w:w="120"/>
+              <w:bottom w:type="dxa" w:w="100"/>
+              <w:right w:type="dxa" w:w="120"/>
+            </w:tcMar>
+          </w:tcPr>
+          <w:p>
+            <w:r>
+              <w:rPr>
+                <w:b w:val="false"/>
+                <w:bCs w:val="false"/>
+                <w:color w:val="1A1A1A"/>
+                <w:sz w:val="20"/>
+                <w:szCs w:val="20"/>
+              </w:rPr>
+              <w:t xml:space="preserve">Günlük planlanan/gerçekleşen karşılaştırması, çizgi grafik ile görselleştirme</w:t>
             </w:r>
           </w:p>
         </w:tc>

</xml_diff>